<commit_message>
Add public project materials and refresh documentation
</commit_message>
<xml_diff>
--- a/docs/report/SDACS_Public_Project_Report_2026.docx
+++ b/docs/report/SDACS_Public_Project_Report_2026.docx
@@ -70,6 +70,9 @@
         <w:gridCol w:w="4680"/>
       </w:tblGrid>
       <w:tr>
+        <w:trPr>
+          <w:cantSplit/>
+        </w:trPr>
         <w:tc>
           <w:tcPr>
             <w:tcW w:type="dxa" w:w="2232"/>
@@ -126,6 +129,9 @@
         </w:tc>
       </w:tr>
       <w:tr>
+        <w:trPr>
+          <w:cantSplit/>
+        </w:trPr>
         <w:tc>
           <w:tcPr>
             <w:tcW w:type="dxa" w:w="2232"/>
@@ -178,6 +184,9 @@
         </w:tc>
       </w:tr>
       <w:tr>
+        <w:trPr>
+          <w:cantSplit/>
+        </w:trPr>
         <w:tc>
           <w:tcPr>
             <w:tcW w:type="dxa" w:w="2232"/>
@@ -230,6 +239,9 @@
         </w:tc>
       </w:tr>
       <w:tr>
+        <w:trPr>
+          <w:cantSplit/>
+        </w:trPr>
         <w:tc>
           <w:tcPr>
             <w:tcW w:type="dxa" w:w="2232"/>
@@ -276,12 +288,15 @@
                 <w:color w:val="1F2937"/>
                 <w:sz w:val="19"/>
               </w:rPr>
-              <w:t>2026-06-13 로컬 검증: Ruff 통과, pytest 4,291 passed / 270 skipped, 100대 60초 시뮬레이션 통과</w:t>
+              <w:t>2026-06-18 로컬 검증: Ruff 통과, pytest 5,444 passed / 270 skipped, 100대 60초 시뮬레이션 실행</w:t>
             </w:r>
           </w:p>
         </w:tc>
       </w:tr>
       <w:tr>
+        <w:trPr>
+          <w:cantSplit/>
+        </w:trPr>
         <w:tc>
           <w:tcPr>
             <w:tcW w:type="dxa" w:w="2232"/>
@@ -430,7 +445,7 @@
                 <w:color w:val="008060"/>
                 <w:sz w:val="32"/>
               </w:rPr>
-              <w:t>0</w:t>
+              <w:t>45</w:t>
               <w:br/>
             </w:r>
             <w:r>
@@ -449,7 +464,7 @@
                 <w:color w:val="5B687C"/>
                 <w:sz w:val="15"/>
               </w:rPr>
-              <w:t>near miss 1</w:t>
+              <w:t>near miss 87</w:t>
             </w:r>
           </w:p>
         </w:tc>
@@ -476,7 +491,7 @@
                 <w:color w:val="008060"/>
                 <w:sz w:val="32"/>
               </w:rPr>
-              <w:t>4,291 pass</w:t>
+              <w:t>5,444 pass</w:t>
               <w:br/>
             </w:r>
             <w:r>
@@ -486,7 +501,7 @@
                 <w:color w:val="1F4E79"/>
                 <w:sz w:val="17"/>
               </w:rPr>
-              <w:t>자동 테스트</w:t>
+              <w:t>Python 테스트</w:t>
               <w:br/>
             </w:r>
             <w:r>
@@ -522,7 +537,7 @@
                 <w:color w:val="008060"/>
                 <w:sz w:val="32"/>
               </w:rPr>
-              <w:t>100%</w:t>
+              <w:t>95.9%</w:t>
               <w:br/>
             </w:r>
             <w:r>
@@ -541,7 +556,7 @@
                 <w:color w:val="5B687C"/>
                 <w:sz w:val="15"/>
               </w:rPr>
-              <w:t>95 conflicts</w:t>
+              <w:t>1,053 conflicts</w:t>
             </w:r>
           </w:p>
         </w:tc>
@@ -663,6 +678,9 @@
         <w:gridCol w:w="3120"/>
       </w:tblGrid>
       <w:tr>
+        <w:trPr>
+          <w:cantSplit/>
+        </w:trPr>
         <w:tc>
           <w:tcPr>
             <w:tcW w:type="dxa" w:w="1440"/>
@@ -746,6 +764,9 @@
         </w:tc>
       </w:tr>
       <w:tr>
+        <w:trPr>
+          <w:cantSplit/>
+        </w:trPr>
         <w:tc>
           <w:tcPr>
             <w:tcW w:type="dxa" w:w="1440"/>
@@ -823,6 +844,9 @@
         </w:tc>
       </w:tr>
       <w:tr>
+        <w:trPr>
+          <w:cantSplit/>
+        </w:trPr>
         <w:tc>
           <w:tcPr>
             <w:tcW w:type="dxa" w:w="1440"/>
@@ -900,6 +924,9 @@
         </w:tc>
       </w:tr>
       <w:tr>
+        <w:trPr>
+          <w:cantSplit/>
+        </w:trPr>
         <w:tc>
           <w:tcPr>
             <w:tcW w:type="dxa" w:w="1440"/>
@@ -977,6 +1004,9 @@
         </w:tc>
       </w:tr>
       <w:tr>
+        <w:trPr>
+          <w:cantSplit/>
+        </w:trPr>
         <w:tc>
           <w:tcPr>
             <w:tcW w:type="dxa" w:w="1440"/>
@@ -1054,6 +1084,9 @@
         </w:tc>
       </w:tr>
       <w:tr>
+        <w:trPr>
+          <w:cantSplit/>
+        </w:trPr>
         <w:tc>
           <w:tcPr>
             <w:tcW w:type="dxa" w:w="1440"/>
@@ -1245,7 +1278,7 @@
           <w:color w:val="1F2937"/>
           <w:sz w:val="22"/>
         </w:rPr>
-        <w:t>아래 수치는 README 최신화에 사용한 동일한 기준입니다. 공개 설명 자료는 과장된 장기 목표보다 현재 저장소에서 재현 가능한 검증 결과를 우선합니다.</w:t>
+        <w:t>아래 수치는 2026-06-18 로컬에서 직접 재현한 기준입니다. README의 4,489+ 종합 수치는 별도 브라우저/E2E 집계를 포함하며, 여기서는 재현한 Python 테스트와 대표 시뮬레이션을 분리해 표시합니다.</w:t>
       </w:r>
     </w:p>
     <w:tbl>
@@ -1261,6 +1294,9 @@
         <w:gridCol w:w="3120"/>
       </w:tblGrid>
       <w:tr>
+        <w:trPr>
+          <w:cantSplit/>
+        </w:trPr>
         <w:tc>
           <w:tcPr>
             <w:tcW w:type="dxa" w:w="2232"/>
@@ -1344,6 +1380,9 @@
         </w:tc>
       </w:tr>
       <w:tr>
+        <w:trPr>
+          <w:cantSplit/>
+        </w:trPr>
         <w:tc>
           <w:tcPr>
             <w:tcW w:type="dxa" w:w="2232"/>
@@ -1421,6 +1460,9 @@
         </w:tc>
       </w:tr>
       <w:tr>
+        <w:trPr>
+          <w:cantSplit/>
+        </w:trPr>
         <w:tc>
           <w:tcPr>
             <w:tcW w:type="dxa" w:w="2232"/>
@@ -1467,7 +1509,7 @@
                 <w:color w:val="1F2937"/>
                 <w:sz w:val="19"/>
               </w:rPr>
-              <w:t>4,291 passed / 270 skipped</w:t>
+              <w:t>5,444 passed / 270 skipped</w:t>
             </w:r>
           </w:p>
         </w:tc>
@@ -1492,12 +1534,15 @@
                 <w:color w:val="1F2937"/>
                 <w:sz w:val="19"/>
               </w:rPr>
-              <w:t>현재 테스트 스위트 기준 실패 없음</w:t>
+              <w:t>현재 Python 테스트 스위트 기준 실패 없음</w:t>
             </w:r>
           </w:p>
         </w:tc>
       </w:tr>
       <w:tr>
+        <w:trPr>
+          <w:cantSplit/>
+        </w:trPr>
         <w:tc>
           <w:tcPr>
             <w:tcW w:type="dxa" w:w="2232"/>
@@ -1544,7 +1589,7 @@
                 <w:color w:val="1F2937"/>
                 <w:sz w:val="19"/>
               </w:rPr>
-              <w:t>60초, seed 42, 충돌 0건</w:t>
+              <w:t>60초, seed 42, 충돌 45건</w:t>
             </w:r>
           </w:p>
         </w:tc>
@@ -1569,12 +1614,15 @@
                 <w:color w:val="1F2937"/>
                 <w:sz w:val="19"/>
               </w:rPr>
-              <w:t>군집 상황에서 핵심 안전 루프 동작 확인</w:t>
+              <w:t>안전 루프가 동작하지만 현재 기본 고밀도 조건은 추가 개선 필요</w:t>
             </w:r>
           </w:p>
         </w:tc>
       </w:tr>
       <w:tr>
+        <w:trPr>
+          <w:cantSplit/>
+        </w:trPr>
         <w:tc>
           <w:tcPr>
             <w:tcW w:type="dxa" w:w="2232"/>
@@ -1621,7 +1669,7 @@
                 <w:color w:val="1F2937"/>
                 <w:sz w:val="19"/>
               </w:rPr>
-              <w:t>conflicts 95, near_miss 1</w:t>
+              <w:t>conflicts 1,053, near_miss 87</w:t>
             </w:r>
           </w:p>
         </w:tc>
@@ -1646,12 +1694,15 @@
                 <w:color w:val="1F2937"/>
                 <w:sz w:val="19"/>
               </w:rPr>
-              <w:t>접근 위험을 탐지하고 실제 충돌로 이어지지 않음</w:t>
+              <w:t>접근 위험과 실제 충돌을 모두 계측</w:t>
             </w:r>
           </w:p>
         </w:tc>
       </w:tr>
       <w:tr>
+        <w:trPr>
+          <w:cantSplit/>
+        </w:trPr>
         <w:tc>
           <w:tcPr>
             <w:tcW w:type="dxa" w:w="2232"/>
@@ -1698,7 +1749,7 @@
                 <w:color w:val="1F2937"/>
                 <w:sz w:val="19"/>
               </w:rPr>
-              <w:t>advisories 45, CBS 9/9 success, A* fallback 115</w:t>
+              <w:t>advisories 178, CBS 5/5 success, A* fallback 80</w:t>
             </w:r>
           </w:p>
         </w:tc>
@@ -1723,12 +1774,15 @@
                 <w:color w:val="1F2937"/>
                 <w:sz w:val="19"/>
               </w:rPr>
-              <w:t>권고와 재계획 경로가 모두 실행됨</w:t>
+              <w:t>권고와 재계획 경로가 실행됨</w:t>
             </w:r>
           </w:p>
         </w:tc>
       </w:tr>
       <w:tr>
+        <w:trPr>
+          <w:cantSplit/>
+        </w:trPr>
         <w:tc>
           <w:tcPr>
             <w:tcW w:type="dxa" w:w="2232"/>
@@ -1775,7 +1829,7 @@
                 <w:color w:val="1F2937"/>
                 <w:sz w:val="19"/>
               </w:rPr>
-              <w:t>12,245 sent / 12,245 delivered / 0 dropped</w:t>
+              <w:t>12,278 sent / 12,278 delivered / 0 dropped</w:t>
             </w:r>
           </w:p>
         </w:tc>
@@ -1806,6 +1860,9 @@
         </w:tc>
       </w:tr>
       <w:tr>
+        <w:trPr>
+          <w:cantSplit/>
+        </w:trPr>
         <w:tc>
           <w:tcPr>
             <w:tcW w:type="dxa" w:w="2232"/>
@@ -1852,7 +1909,7 @@
                 <w:color w:val="1F2937"/>
                 <w:sz w:val="19"/>
               </w:rPr>
-              <w:t>23.429 km, 2.85 Wh/km</w:t>
+              <w:t>45.841 km, 5.08 Wh/km</w:t>
             </w:r>
           </w:p>
         </w:tc>
@@ -1885,6 +1942,25 @@
     </w:tbl>
     <w:p>
       <w:pPr>
+        <w:spacing w:before="120" w:after="160" w:line="264" w:lineRule="auto"/>
+      </w:pPr>
+      <w:r>
+        <w:rPr>
+          <w:rFonts w:ascii="Malgun Gothic" w:hAnsi="Malgun Gothic" w:eastAsia="Malgun Gothic"/>
+          <w:b/>
+          <w:color w:val="B06F00"/>
+          <w:sz w:val="20"/>
+        </w:rPr>
+        <w:t>중요: 이 결과는 안전 인증 완료를 의미하지 않습니다. 현재 대표 실행에서 45건의 충돌이 기록되었으므로, SDACS는 실제 운용 시스템이 아니라 연구·교육·알고리즘 개선을 위한 시뮬레이터로 설명해야 합니다.</w:t>
+      </w:r>
+    </w:p>
+    <w:p>
+      <w:r>
+        <w:br w:type="page"/>
+      </w:r>
+    </w:p>
+    <w:p>
+      <w:pPr>
         <w:spacing w:before="200" w:after="100"/>
       </w:pPr>
       <w:r>
@@ -1909,6 +1985,9 @@
         <w:gridCol w:w="4680"/>
       </w:tblGrid>
       <w:tr>
+        <w:trPr>
+          <w:cantSplit/>
+        </w:trPr>
         <w:tc>
           <w:tcPr>
             <w:tcW w:type="dxa" w:w="2736"/>
@@ -1965,6 +2044,9 @@
         </w:tc>
       </w:tr>
       <w:tr>
+        <w:trPr>
+          <w:cantSplit/>
+        </w:trPr>
         <w:tc>
           <w:tcPr>
             <w:tcW w:type="dxa" w:w="2736"/>
@@ -2017,6 +2099,9 @@
         </w:tc>
       </w:tr>
       <w:tr>
+        <w:trPr>
+          <w:cantSplit/>
+        </w:trPr>
         <w:tc>
           <w:tcPr>
             <w:tcW w:type="dxa" w:w="2736"/>
@@ -2069,6 +2154,9 @@
         </w:tc>
       </w:tr>
       <w:tr>
+        <w:trPr>
+          <w:cantSplit/>
+        </w:trPr>
         <w:tc>
           <w:tcPr>
             <w:tcW w:type="dxa" w:w="2736"/>
@@ -2121,6 +2209,9 @@
         </w:tc>
       </w:tr>
       <w:tr>
+        <w:trPr>
+          <w:cantSplit/>
+        </w:trPr>
         <w:tc>
           <w:tcPr>
             <w:tcW w:type="dxa" w:w="2736"/>
@@ -2167,12 +2258,15 @@
                 <w:color w:val="1F2937"/>
                 <w:sz w:val="19"/>
               </w:rPr>
-              <w:t>100대 60초 검증에서 충돌 0건, 전체 테스트 4,291건 통과를 확인했습니다.</w:t>
+              <w:t>전체 Python 테스트 5,444건은 통과했지만, 100대 60초 대표 실행에서는 충돌 45건이 남아 있음을 확인했습니다.</w:t>
             </w:r>
           </w:p>
         </w:tc>
       </w:tr>
       <w:tr>
+        <w:trPr>
+          <w:cantSplit/>
+        </w:trPr>
         <w:tc>
           <w:tcPr>
             <w:tcW w:type="dxa" w:w="2736"/>
@@ -2219,7 +2313,7 @@
                 <w:color w:val="1F2937"/>
                 <w:sz w:val="19"/>
               </w:rPr>
-              <w:t>시뮬레이터와 API를 더 단순한 체험 흐름으로 묶고, 실제 장비/HITL 검증 자료를 강화하는 것입니다.</w:t>
+              <w:t>충돌 원인을 줄이는 알고리즘/파라미터 최적화, 대규모 벤치마크, 실제 장비/HITL 검증을 강화하는 것입니다.</w:t>
             </w:r>
           </w:p>
         </w:tc>
@@ -2257,6 +2351,9 @@
         <w:gridCol w:w="3120"/>
       </w:tblGrid>
       <w:tr>
+        <w:trPr>
+          <w:cantSplit/>
+        </w:trPr>
         <w:tc>
           <w:tcPr>
             <w:tcW w:type="dxa" w:w="1944"/>
@@ -2340,6 +2437,9 @@
         </w:tc>
       </w:tr>
       <w:tr>
+        <w:trPr>
+          <w:cantSplit/>
+        </w:trPr>
         <w:tc>
           <w:tcPr>
             <w:tcW w:type="dxa" w:w="1944"/>
@@ -2417,6 +2517,9 @@
         </w:tc>
       </w:tr>
       <w:tr>
+        <w:trPr>
+          <w:cantSplit/>
+        </w:trPr>
         <w:tc>
           <w:tcPr>
             <w:tcW w:type="dxa" w:w="1944"/>
@@ -2494,6 +2597,9 @@
         </w:tc>
       </w:tr>
       <w:tr>
+        <w:trPr>
+          <w:cantSplit/>
+        </w:trPr>
         <w:tc>
           <w:tcPr>
             <w:tcW w:type="dxa" w:w="1944"/>
@@ -2571,6 +2677,9 @@
         </w:tc>
       </w:tr>
       <w:tr>
+        <w:trPr>
+          <w:cantSplit/>
+        </w:trPr>
         <w:tc>
           <w:tcPr>
             <w:tcW w:type="dxa" w:w="1944"/>
@@ -2758,6 +2867,9 @@
         <w:gridCol w:w="4680"/>
       </w:tblGrid>
       <w:tr>
+        <w:trPr>
+          <w:cantSplit/>
+        </w:trPr>
         <w:tc>
           <w:tcPr>
             <w:tcW w:type="dxa" w:w="2160"/>
@@ -2814,6 +2926,9 @@
         </w:tc>
       </w:tr>
       <w:tr>
+        <w:trPr>
+          <w:cantSplit/>
+        </w:trPr>
         <w:tc>
           <w:tcPr>
             <w:tcW w:type="dxa" w:w="2160"/>
@@ -2866,6 +2981,9 @@
         </w:tc>
       </w:tr>
       <w:tr>
+        <w:trPr>
+          <w:cantSplit/>
+        </w:trPr>
         <w:tc>
           <w:tcPr>
             <w:tcW w:type="dxa" w:w="2160"/>
@@ -2918,6 +3036,9 @@
         </w:tc>
       </w:tr>
       <w:tr>
+        <w:trPr>
+          <w:cantSplit/>
+        </w:trPr>
         <w:tc>
           <w:tcPr>
             <w:tcW w:type="dxa" w:w="2160"/>
@@ -3028,7 +3149,7 @@
         <w:color w:val="5B687C"/>
         <w:sz w:val="17"/>
       </w:rPr>
-      <w:t>SDACS Public Project Report | Updated 2026-06-13</w:t>
+      <w:t>SDACS Public Project Report | Updated 2026-06-18</w:t>
     </w:r>
   </w:p>
 </w:hdr>

</xml_diff>